<commit_message>
Changing name to flannalyser, adding a print button to test data viewer with new word template, starting with more than two port measurements
</commit_message>
<xml_diff>
--- a/skrf_qtapps/sql_qtwidgets/report_template.docx
+++ b/skrf_qtapps/sql_qtwidgets/report_template.docx
@@ -10,15 +10,16 @@
         <w:tblLook w:val="04A0" w:firstRow="1" w:lastRow="0" w:firstColumn="1" w:lastColumn="0" w:noHBand="0" w:noVBand="1"/>
       </w:tblPr>
       <w:tblGrid>
-        <w:gridCol w:w="2254"/>
-        <w:gridCol w:w="2254"/>
-        <w:gridCol w:w="2254"/>
-        <w:gridCol w:w="2254"/>
+        <w:gridCol w:w="1804"/>
+        <w:gridCol w:w="1803"/>
+        <w:gridCol w:w="1803"/>
+        <w:gridCol w:w="1803"/>
+        <w:gridCol w:w="1803"/>
       </w:tblGrid>
       <w:tr>
         <w:tc>
           <w:tcPr>
-            <w:tcW w:w="1250" w:type="pct"/>
+            <w:tcW w:w="1000" w:type="pct"/>
           </w:tcPr>
           <w:p>
             <w:pPr>
@@ -44,7 +45,7 @@
         </w:tc>
         <w:tc>
           <w:tcPr>
-            <w:tcW w:w="1250" w:type="pct"/>
+            <w:tcW w:w="1000" w:type="pct"/>
           </w:tcPr>
           <w:p>
             <w:pPr>
@@ -70,7 +71,7 @@
         </w:tc>
         <w:tc>
           <w:tcPr>
-            <w:tcW w:w="1250" w:type="pct"/>
+            <w:tcW w:w="1000" w:type="pct"/>
           </w:tcPr>
           <w:p>
             <w:pPr>
@@ -96,7 +97,8 @@
         </w:tc>
         <w:tc>
           <w:tcPr>
-            <w:tcW w:w="1250" w:type="pct"/>
+            <w:tcW w:w="2000" w:type="pct"/>
+            <w:gridSpan w:val="2"/>
           </w:tcPr>
           <w:p>
             <w:pPr>
@@ -124,7 +126,7 @@
       <w:tr>
         <w:tc>
           <w:tcPr>
-            <w:tcW w:w="1250" w:type="pct"/>
+            <w:tcW w:w="1000" w:type="pct"/>
           </w:tcPr>
           <w:p>
             <w:pPr>
@@ -150,7 +152,7 @@
         </w:tc>
         <w:tc>
           <w:tcPr>
-            <w:tcW w:w="1250" w:type="pct"/>
+            <w:tcW w:w="1000" w:type="pct"/>
           </w:tcPr>
           <w:p>
             <w:pPr>
@@ -176,7 +178,7 @@
         </w:tc>
         <w:tc>
           <w:tcPr>
-            <w:tcW w:w="1250" w:type="pct"/>
+            <w:tcW w:w="1000" w:type="pct"/>
           </w:tcPr>
           <w:p>
             <w:pPr>
@@ -202,7 +204,33 @@
         </w:tc>
         <w:tc>
           <w:tcPr>
-            <w:tcW w:w="1250" w:type="pct"/>
+            <w:tcW w:w="1000" w:type="pct"/>
+          </w:tcPr>
+          <w:p>
+            <w:pPr>
+              <w:rPr>
+                <w:rFonts w:ascii="Calibri" w:hAnsi="Calibri" w:cs="Calibri"/>
+                <w:i/>
+                <w:iCs/>
+                <w:sz w:val="18"/>
+                <w:szCs w:val="18"/>
+              </w:rPr>
+            </w:pPr>
+            <w:r>
+              <w:rPr>
+                <w:rFonts w:ascii="Calibri" w:hAnsi="Calibri" w:cs="Calibri"/>
+                <w:i/>
+                <w:iCs/>
+                <w:sz w:val="18"/>
+                <w:szCs w:val="18"/>
+              </w:rPr>
+              <w:t>ISM</w:t>
+            </w:r>
+          </w:p>
+        </w:tc>
+        <w:tc>
+          <w:tcPr>
+            <w:tcW w:w="1000" w:type="pct"/>
           </w:tcPr>
           <w:p>
             <w:pPr>
@@ -1998,6 +2026,7 @@
   </w:compat>
   <w:rsids>
     <w:rsidRoot w:val="00A02193"/>
+    <w:rsid w:val="0010077A"/>
     <w:rsid w:val="00156CD1"/>
     <w:rsid w:val="002341B2"/>
     <w:rsid w:val="0029725F"/>
@@ -2006,12 +2035,17 @@
     <w:rsid w:val="00635AAC"/>
     <w:rsid w:val="00644A59"/>
     <w:rsid w:val="006459DE"/>
+    <w:rsid w:val="007441B5"/>
     <w:rsid w:val="007B3663"/>
     <w:rsid w:val="007C119D"/>
     <w:rsid w:val="0083332D"/>
+    <w:rsid w:val="008462B1"/>
     <w:rsid w:val="00873130"/>
     <w:rsid w:val="00A02193"/>
+    <w:rsid w:val="00A035B1"/>
     <w:rsid w:val="00A400E0"/>
+    <w:rsid w:val="00CC3D34"/>
+    <w:rsid w:val="00D239FF"/>
     <w:rsid w:val="00D562D4"/>
     <w:rsid w:val="00EA1845"/>
     <w:rsid w:val="00EB28E8"/>

</xml_diff>